<commit_message>
Countdown-volgorde corrigeren in EP. 5, 7 en 8
De opbouw van zwakste naar sterkste klopte op drie plekken niet, en twee
bruggen beloofden iets anders dan er volgde.

- EP. 5: flessenwater naar 4, vloerbedekking naar 5; brug herschreven
- EP. 7: friluftsliv naar 3, tweedehands naar 4; brug verplaatst en herschreven
- EP. 8: opbergruimte naar 5, kamer-voor-gelegenheden naar 4; brug verplaatst
  en teruggebracht naar vier items
- EP. 6 ongewijzigd

Google Docs vervangen; nieuwe doc-IDs staan in de index.

Co-Authored-By: Claude Opus 5 <noreply@anthropic.com>
Claude-Session: https://claude.ai/code/session_01NiPiki8nLSACpBSQDfiYJ3
</commit_message>
<xml_diff>
--- a/scripts/onpersoonlijk/EP05-13-things-youll-never-find-in-a-nordic-home.docx
+++ b/scripts/onpersoonlijk/EP05-13-things-youll-never-find-in-a-nordic-home.docx
@@ -15,7 +15,7 @@
         <w:rPr>
           <w:b w:val="0"/>
         </w:rPr>
-        <w:t>Total words: 2,768 | Estimated length: ~16:17 min (at 170 wpm)</w:t>
+        <w:t>Total words: 2,775 | Estimated length: ~16:19 min (at 170 wpm)</w:t>
       </w:r>
     </w:p>
     <w:p>
@@ -455,7 +455,47 @@
         <w:rPr>
           <w:b w:val="0"/>
         </w:rPr>
-        <w:t>Number five. Bottled water in the fridge.</w:t>
+        <w:t>Number five. Wall-to-wall carpet.</w:t>
+      </w:r>
+    </w:p>
+    <w:p>
+      <w:r>
+        <w:rPr>
+          <w:b w:val="0"/>
+        </w:rPr>
+        <w:t>Floors here are wood, or tile, or something that can be washed. Rugs exist, but they are objects you can pick up, take outside, beat, and put back down.</w:t>
+      </w:r>
+    </w:p>
+    <w:p>
+      <w:r>
+        <w:rPr>
+          <w:b w:val="0"/>
+        </w:rPr>
+        <w:t>That is the test almost everything in a Nordic house has to pass: can it be taken out, aired, washed and brought back? If the answer is no, it tends not to be in the room.</w:t>
+      </w:r>
+    </w:p>
+    <w:p>
+      <w:r>
+        <w:rPr>
+          <w:b w:val="0"/>
+        </w:rPr>
+        <w:t>Fitted carpet fails that test permanently. It is a floor that can never actually be cleaned — only the top of it can be treated. Everything the shoes and the weather and the years put into it stays in it, and there is no version of that room in which the floor is genuinely finished.</w:t>
+      </w:r>
+    </w:p>
+    <w:p>
+      <w:r>
+        <w:rPr>
+          <w:b w:val="0"/>
+        </w:rPr>
+        <w:t>And once the floor can be washed, the furniture starts standing on legs, which is the other thing visitors notice and misread as a style. Sofas on legs. Beds on legs. Bathroom cabinets hung off the wall entirely with clear floor underneath. A mop goes under all of that in one pass. It does not go under a plinth, which is why there is a small archaeological site beneath most sofas in the world.</w:t>
+      </w:r>
+    </w:p>
+    <w:p>
+      <w:r>
+        <w:rPr>
+          <w:b w:val="0"/>
+        </w:rPr>
+        <w:t>Number four. Bottled water in the fridge.</w:t>
       </w:r>
     </w:p>
     <w:p>
@@ -495,47 +535,7 @@
         <w:rPr>
           <w:b w:val="0"/>
         </w:rPr>
-        <w:t>Number four. Wall-to-wall carpet.</w:t>
-      </w:r>
-    </w:p>
-    <w:p>
-      <w:r>
-        <w:rPr>
-          <w:b w:val="0"/>
-        </w:rPr>
-        <w:t>Floors here are wood, or tile, or something that can be washed. Rugs exist, but they are objects you can pick up, take outside, beat, and put back down.</w:t>
-      </w:r>
-    </w:p>
-    <w:p>
-      <w:r>
-        <w:rPr>
-          <w:b w:val="0"/>
-        </w:rPr>
-        <w:t>That is the test almost everything in a Nordic house has to pass: can it be taken out, aired, washed and brought back? If the answer is no, it tends not to be in the room.</w:t>
-      </w:r>
-    </w:p>
-    <w:p>
-      <w:r>
-        <w:rPr>
-          <w:b w:val="0"/>
-        </w:rPr>
-        <w:t>Fitted carpet fails that test permanently. It is a floor that can never actually be cleaned — only the top of it can be treated. Everything the shoes and the weather and the years put into it stays in it, and there is no version of that room in which the floor is genuinely finished.</w:t>
-      </w:r>
-    </w:p>
-    <w:p>
-      <w:r>
-        <w:rPr>
-          <w:b w:val="0"/>
-        </w:rPr>
-        <w:t>And once the floor can be washed, the furniture starts standing on legs, which is the other thing visitors notice and misread as a style. Sofas on legs. Beds on legs. Bathroom cabinets hung off the wall entirely with clear floor underneath. A mop goes under all of that in one pass. It does not go under a plinth, which is why there is a small archaeological site beneath most sofas in the world.</w:t>
-      </w:r>
-    </w:p>
-    <w:p>
-      <w:r>
-        <w:rPr>
-          <w:b w:val="0"/>
-        </w:rPr>
-        <w:t>Everything so far has been an object. The last three are about what a house is allowed to say, and that is where the happiness question in the title actually gets answered.</w:t>
+        <w:t>Everything so far has been an object you could remove this weekend. The last three are decisions that were made long before the house was finished, and that is where the happiness question in the title actually gets answered.</w:t>
       </w:r>
     </w:p>
     <w:p>

</xml_diff>